<commit_message>
Remove closing line from Ghost Hunt document
</commit_message>
<xml_diff>
--- a/docs/Miller_Myles_Activity11_GhostHunt.docx
+++ b/docs/Miller_Myles_Activity11_GhostHunt.docx
@@ -2492,11 +2492,6 @@
         <w:t>The entry screen and personalized ballroom, captured from the running Android app. The form is replaced on success, so the previous guest book cannot be resubmitted with Back.</w:t>
       </w:r>
     </w:p>
-    <w:p>
-      <w:r>
-        <w:t>Each member must explain a screen during the class demonstration and upload the required artifacts individually.</w:t>
-      </w:r>
-    </w:p>
     <w:sectPr>
       <w:headerReference w:type="default" r:id="rId9"/>
       <w:footerReference w:type="default" r:id="rId10"/>

</xml_diff>